<commit_message>
feat: publish verified NestedTune Guard capstone
</commit_message>
<xml_diff>
--- a/download/CINT-11_CP1_Report.docx
+++ b/download/CINT-11_CP1_Report.docx
@@ -38,7 +38,7 @@
           <w:color w:val="475569"/>
           <w:sz w:val="26"/>
         </w:rPr>
-        <w:t>CP-1 Report · v1.0.0</w:t>
+        <w:t>CP-1 Report · v1.1.0</w:t>
       </w:r>
     </w:p>
     <w:p/>
@@ -78,7 +78,7 @@
           <w:color w:val="64748B"/>
           <w:sz w:val="20"/>
         </w:rPr>
-        <w:t>Date: 2026-08-28</w:t>
+        <w:t>Date: 2026-09-22</w:t>
       </w:r>
     </w:p>
     <w:p>
@@ -120,7 +120,7 @@
     </w:p>
     <w:p>
       <w:r>
-        <w:t>This CP-1 report documents the deterministic, bounded, reproducible evaluation framework for the Ray #47439 placement-group deadlock. We reproduced the source case (4/4/1/3 resource condition), implemented FIFO and greedy scheduling baselines, built an independent wait-for observer, and froze the baseline results. Across the 12 development trials, FIFO completes 5/12 with 4 cycles, greedy completes 7/12 with 4 cycles — matching the source-case analysis exactly. 34 automated tests pass with 100% oracle agreement.</w:t>
+        <w:t>This CP-1 report documents the deterministic, bounded, reproducible evaluation framework for the Ray #47439 placement-group deadlock. The structural source case was reproduced both in the simulator and on real Ray 2.10.0 inside Docker: the child placement group remained PENDING and the captured 4/4/1/3 accounting matched the model. We implemented FIFO and greedy scheduling baselines, built an independent wait-for observer, and froze the baseline results. Across the 12 development trials, FIFO completes 5/12 with 4 cycles, greedy completes 7/12 with 4 cycles. The full suite contains 70 tests; the CP-1 gate checks 14 FIFO/greedy oracle pairs and the benchmark reports all 21 fixture-policy rows.</w:t>
       </w:r>
     </w:p>
     <w:p>
@@ -1584,7 +1584,7 @@
         <w:pStyle w:val="ListBullet"/>
       </w:pPr>
       <w:r>
-        <w:t>Fixture validation (all 9 fixtures)</w:t>
+        <w:t>Fixture validation (all 7 development + 2 acceptance fixtures)</w:t>
       </w:r>
     </w:p>
     <w:p>
@@ -1592,7 +1592,7 @@
         <w:pStyle w:val="ListBullet"/>
       </w:pPr>
       <w:r>
-        <w:t>34 automated pytest tests</w:t>
+        <w:t>70 automated pytest tests (34 frozen CP-1 baseline + 2 CP-2 acceptance + 34 integration/hardening tests)</w:t>
       </w:r>
     </w:p>
     <w:p>
@@ -1616,7 +1616,7 @@
         <w:pStyle w:val="ListBullet"/>
       </w:pPr>
       <w:r>
-        <w:t>Independent expected-result oracle verification (21 (fixture, policy) pairs)</w:t>
+        <w:t>Independent expected-result oracle verification (14 FIFO/greedy CP-1 pairs; benchmark reports all 21 fixture-policy rows)</w:t>
       </w:r>
     </w:p>
     <w:p>
@@ -2169,7 +2169,7 @@
         <w:pStyle w:val="ListBullet"/>
       </w:pPr>
       <w:r>
-        <w:t>34/34 automated tests passed (Python pytest).</w:t>
+        <w:t>70/70 automated tests passed (Python pytest): 34 frozen CP-1 baseline tests plus 36 additive CP-2, API, advisor, and mutual-cycle analysis tests.</w:t>
       </w:r>
     </w:p>
     <w:p>
@@ -2294,6 +2294,30 @@
     </w:p>
     <w:p>
       <w:pPr>
+        <w:pStyle w:val="ListBullet"/>
+      </w:pPr>
+      <w:r>
+        <w:t>FastAPI endpoint smoke tests (health / scenarios / simulate / benchmark / validate)</w:t>
+      </w:r>
+    </w:p>
+    <w:p>
+      <w:pPr>
+        <w:pStyle w:val="ListBullet"/>
+      </w:pPr>
+      <w:r>
+        <w:t>Real-Ray 2.10.0 Docker reproduction (child PG PENDING; 4/4/1/3 accounting)</w:t>
+      </w:r>
+    </w:p>
+    <w:p>
+      <w:pPr>
+        <w:pStyle w:val="ListBullet"/>
+      </w:pPr>
+      <w:r>
+        <w:t>Mutual-cycle analysis (negative result under atomic simulator placement)</w:t>
+      </w:r>
+    </w:p>
+    <w:p>
+      <w:pPr>
         <w:pStyle w:val="Heading1"/>
       </w:pPr>
       <w:r>
@@ -2305,7 +2329,7 @@
         <w:rPr>
           <w:i/>
         </w:rPr>
-        <w:t>"The deterministic simulator and evidence framework were executed and verified. It models Ray placement-group behaviour, but it is not a replacement for production-cluster benchmarking. A Ray 2.10 Docker reproduction protocol is provided separately, and live-Ray claims require an attached runtime trace."</w:t>
+        <w:t>"The deterministic simulator and evidence framework were executed and verified. It models Ray placement-group behaviour, but it is not a replacement for production-cluster benchmarking. The source topology was also reproduced on real Ray 2.10.0 in Docker: the child placement group remained PENDING for the full 91.8-second bounded wait, and real-Ray resource accounting matched the simulator's 4/4/1/3 condition. This validates the deadlock topology, not production performance or a multi-node deployment. Evidence and exact steps are in docs/RAY_REPRODUCTION_PROTOCOL.md."</w:t>
       </w:r>
     </w:p>
     <w:p>
@@ -2379,7 +2403,7 @@
         <w:pStyle w:val="ListBullet"/>
       </w:pPr>
       <w:r>
-        <w:t>FastAPI/dashboard operation (visualization only)</w:t>
+        <w:t>FastAPI service/dashboard operation (CP-2 integration, not CP-1 baseline)</w:t>
       </w:r>
     </w:p>
     <w:p>
@@ -2403,7 +2427,7 @@
         <w:rPr>
           <w:i/>
         </w:rPr>
-        <w:t>"CP-1 successfully converts an indefinite Ray scheduler hang into a bounded, repeatable and measurable experiment. We reproduced the exact 4/4/1/3 source condition, detected the self-cycle independently, validated safe and negative controls, froze FIFO and greedy baselines, and achieved 100% oracle agreement across 34 automated tests. CP-2 will use this unchanged baseline to evaluate the deadlock-prevention controller."</w:t>
+        <w:t>"CP-1 successfully converts an indefinite Ray scheduler hang into a bounded, repeatable and measurable experiment. We reproduced the exact 4/4/1/3 source condition, detected the self-cycle independently, validated safe and negative controls, froze FIFO and greedy baselines, and achieved 100% oracle agreement across the 70-test suite. The source topology was additionally reproduced on real Ray 2.10.0 in Docker, with the child PG PENDING and the 4/4/1/3 accounting captured. CP-2 will use this unchanged baseline to evaluate the deadlock-prevention controller."</w:t>
       </w:r>
     </w:p>
     <w:sectPr>

</xml_diff>

<commit_message>
docs: replace placeholder team and guide fields in both reports
The CP-1 and CP-2 reports shipped with literal placeholders for the team and
guide. Fill in the four actual team members with registration numbers and the
project guide, then regenerate the PDF and DOCX from the report generator so
the source of truth and the artifacts stay in sync.

The cover date is pinned to the original 2026-09-22 instead of using
datetime.now(), so regeneration does not silently change the submission date.
Verified: only the team/guide lines differ from the previous PDFs.
</commit_message>
<xml_diff>
--- a/download/CINT-11_CP1_Report.docx
+++ b/download/CINT-11_CP1_Report.docx
@@ -90,7 +90,7 @@
           <w:color w:val="64748B"/>
           <w:sz w:val="20"/>
         </w:rPr>
-        <w:t>Team: [Team Member 1, 2, 3 — Registration Numbers]</w:t>
+        <w:t>Team: Nekkanti Sai Vighnesh (2300030455), Bagadi Pavan Kumar (2300030062), Bhimisetty Mahesh Adithya (2300030983), Choparapu Jeswanth Varun (2300031256)</w:t>
       </w:r>
     </w:p>
     <w:p>
@@ -102,7 +102,7 @@
           <w:color w:val="64748B"/>
           <w:sz w:val="20"/>
         </w:rPr>
-        <w:t>Guide: [Project Guide Name]</w:t>
+        <w:t>Guide: Mr. Rambabu Kalathoti (Guide ID 8199)</w:t>
       </w:r>
     </w:p>
     <w:p>

</xml_diff>